<commit_message>
Update technical brief: base DO pulse gripper control + firmware notes (19 Feb 2026)
</commit_message>
<xml_diff>
--- a/docs/architecture/robotics_technical_brief.docx
+++ b/docs/architecture/robotics_technical_brief.docx
@@ -25,7 +25,7 @@
           <w:sz w:val="48"/>
           <w:szCs w:val="48"/>
         </w:rPr>
-        <w:t>4</w:t>
+        <w:t>5</w:t>
       </w:r>
       <w:r>
         <w:rPr>
@@ -68,7 +68,15 @@
       </w:pPr>
       <w:r>
         <w:rPr/>
-        <w:t>Last edited by: Albert on 18 Feb 2026</w:t>
+        <w:t>Last edited by: Albert on 1</w:t>
+      </w:r>
+      <w:r>
+        <w:rPr/>
+        <w:t>9</w:t>
+      </w:r>
+      <w:r>
+        <w:rPr/>
+        <w:t xml:space="preserve"> Feb 2026</w:t>
       </w:r>
     </w:p>
     <w:p>
@@ -628,13 +636,7 @@
         <w:rPr>
           <w:lang w:val="en-AU"/>
         </w:rPr>
-        <w:t>Robot Subnet: 192.168.5.</w:t>
-      </w:r>
-      <w:r>
-        <w:rPr>
-          <w:lang w:val="en-AU"/>
-        </w:rPr>
-        <w:t>1</w:t>
+        <w:t>Robot Subnet: 192.168.5.1</w:t>
       </w:r>
     </w:p>
     <w:p>
@@ -653,13 +655,7 @@
         <w:rPr>
           <w:lang w:val="en-AU"/>
         </w:rPr>
-        <w:t>XR / Vision Subnet: 169.254.1.</w:t>
-      </w:r>
-      <w:r>
-        <w:rPr>
-          <w:lang w:val="en-AU"/>
-        </w:rPr>
-        <w:t>10</w:t>
+        <w:t>XR / Vision Subnet: 169.254.1.10</w:t>
       </w:r>
     </w:p>
     <w:p>
@@ -678,13 +674,7 @@
         <w:rPr>
           <w:lang w:val="en-AU"/>
         </w:rPr>
-        <w:t>L</w:t>
-      </w:r>
-      <w:r>
-        <w:rPr>
-          <w:lang w:val="en-AU"/>
-        </w:rPr>
-        <w:t>aptop/Unity 169.254.1.5</w:t>
+        <w:t>Laptop/Unity 169.254.1.5</w:t>
       </w:r>
     </w:p>
     <w:p>
@@ -2825,7 +2815,9 @@
         </w:rPr>
       </w:pPr>
       <w:r>
-        <w:rPr/>
+        <w:rPr>
+          <w:lang w:val="en-AU"/>
+        </w:rPr>
       </w:r>
     </w:p>
     <w:p>
@@ -2859,13 +2851,7 @@
         <w:rPr>
           <w:rStyle w:val="Strong"/>
         </w:rPr>
-        <w:t>R</w:t>
-      </w:r>
-      <w:r>
-        <w:rPr>
-          <w:rStyle w:val="Strong"/>
-        </w:rPr>
-        <w:t>obot_armed gate</w:t>
+        <w:t>Robot_armed gate</w:t>
       </w:r>
       <w:r>
         <w:rPr/>
@@ -2874,7 +2860,7 @@
     </w:p>
     <w:p>
       <w:pPr>
-        <w:pStyle w:val="Normal"/>
+        <w:pStyle w:val="BodyText"/>
         <w:rPr>
           <w:rFonts w:ascii="Aptos" w:hAnsi="Aptos"/>
           <w:lang w:val="en-AU"/>
@@ -2882,6 +2868,423 @@
       </w:pPr>
       <w:r>
         <w:rPr/>
+      </w:r>
+    </w:p>
+    <w:p>
+      <w:pPr>
+        <w:pStyle w:val="Heading3"/>
+        <w:rPr>
+          <w:rFonts w:ascii="Aptos" w:hAnsi="Aptos"/>
+          <w:lang w:val="en-AU"/>
+        </w:rPr>
+      </w:pPr>
+      <w:r>
+        <w:rPr>
+          <w:rFonts w:ascii="Aptos" w:hAnsi="Aptos"/>
+          <w:lang w:val="en-AU"/>
+        </w:rPr>
+        <w:t>4.1 Gripper Control Architecture (Validated 19 Feb 2026)</w:t>
+      </w:r>
+    </w:p>
+    <w:p>
+      <w:pPr>
+        <w:pStyle w:val="BodyText"/>
+        <w:rPr/>
+      </w:pPr>
+      <w:r>
+        <w:rPr/>
+        <w:t>Gripper: DH Robotics PGE5-26</w:t>
+        <w:br/>
+        <w:t xml:space="preserve">Connection: </w:t>
+      </w:r>
+      <w:r>
+        <w:rPr>
+          <w:rStyle w:val="Strong"/>
+        </w:rPr>
+        <w:t>Base I/O (DO_1)</w:t>
+      </w:r>
+      <w:r>
+        <w:rPr/>
+        <w:br/>
+        <w:t>Control Mode: I/O Mode (edge-triggered pulse)</w:t>
+      </w:r>
+    </w:p>
+    <w:p>
+      <w:pPr>
+        <w:pStyle w:val="BodyText"/>
+        <w:rPr/>
+      </w:pPr>
+      <w:r>
+        <w:rPr/>
+        <w:t>Key findings from integration:</w:t>
+      </w:r>
+    </w:p>
+    <w:p>
+      <w:pPr>
+        <w:pStyle w:val="BodyText"/>
+        <w:numPr>
+          <w:ilvl w:val="0"/>
+          <w:numId w:val="31"/>
+        </w:numPr>
+        <w:tabs>
+          <w:tab w:val="clear" w:pos="720"/>
+          <w:tab w:val="left" w:pos="0" w:leader="none"/>
+        </w:tabs>
+        <w:ind w:hanging="283" w:left="709"/>
+        <w:rPr/>
+      </w:pPr>
+      <w:r>
+        <w:rPr/>
+        <w:t>ToolDOExecute() not supported on current firmware.</w:t>
+      </w:r>
+    </w:p>
+    <w:p>
+      <w:pPr>
+        <w:pStyle w:val="BodyText"/>
+        <w:numPr>
+          <w:ilvl w:val="0"/>
+          <w:numId w:val="31"/>
+        </w:numPr>
+        <w:tabs>
+          <w:tab w:val="clear" w:pos="720"/>
+          <w:tab w:val="left" w:pos="0" w:leader="none"/>
+        </w:tabs>
+        <w:ind w:hanging="283" w:left="709"/>
+        <w:rPr/>
+      </w:pPr>
+      <w:r>
+        <w:rPr/>
+        <w:t>ToolDO() supported but not relevant (gripper not wired to tool flange).</w:t>
+      </w:r>
+    </w:p>
+    <w:p>
+      <w:pPr>
+        <w:pStyle w:val="BodyText"/>
+        <w:numPr>
+          <w:ilvl w:val="0"/>
+          <w:numId w:val="31"/>
+        </w:numPr>
+        <w:tabs>
+          <w:tab w:val="clear" w:pos="720"/>
+          <w:tab w:val="left" w:pos="0" w:leader="none"/>
+        </w:tabs>
+        <w:ind w:hanging="283" w:left="709"/>
+        <w:rPr/>
+      </w:pPr>
+      <w:r>
+        <w:rPr/>
+        <w:t>DO(index, value) supported (queued execution model).</w:t>
+      </w:r>
+    </w:p>
+    <w:p>
+      <w:pPr>
+        <w:pStyle w:val="BodyText"/>
+        <w:numPr>
+          <w:ilvl w:val="0"/>
+          <w:numId w:val="31"/>
+        </w:numPr>
+        <w:tabs>
+          <w:tab w:val="clear" w:pos="720"/>
+          <w:tab w:val="left" w:pos="0" w:leader="none"/>
+        </w:tabs>
+        <w:ind w:hanging="283" w:left="709"/>
+        <w:rPr/>
+      </w:pPr>
+      <w:r>
+        <w:rPr/>
+        <w:t>Continue() required to execute queued commands.</w:t>
+      </w:r>
+    </w:p>
+    <w:p>
+      <w:pPr>
+        <w:pStyle w:val="BodyText"/>
+        <w:rPr/>
+      </w:pPr>
+      <w:r>
+        <w:rPr/>
+        <w:t>Gripper actuation model:</w:t>
+      </w:r>
+    </w:p>
+    <w:p>
+      <w:pPr>
+        <w:pStyle w:val="BodyText"/>
+        <w:rPr/>
+      </w:pPr>
+      <w:r>
+        <w:rPr/>
+        <w:t>DO(1, x) → Continue()</w:t>
+      </w:r>
+    </w:p>
+    <w:p>
+      <w:pPr>
+        <w:pStyle w:val="BodyText"/>
+        <w:rPr/>
+      </w:pPr>
+      <w:r>
+        <w:rPr/>
+        <w:t>However, the gripper does not behave as a level-based latch.</w:t>
+        <w:br/>
+        <w:t xml:space="preserve">It responds to </w:t>
+      </w:r>
+      <w:r>
+        <w:rPr>
+          <w:rStyle w:val="Strong"/>
+        </w:rPr>
+        <w:t>pulse edges</w:t>
+      </w:r>
+      <w:r>
+        <w:rPr/>
+        <w:t>, not sustained signal levels.</w:t>
+      </w:r>
+    </w:p>
+    <w:p>
+      <w:pPr>
+        <w:pStyle w:val="BodyText"/>
+        <w:rPr/>
+      </w:pPr>
+      <w:r>
+        <w:rPr/>
+        <w:t>Therefore, gripper control is implemented as:</w:t>
+      </w:r>
+    </w:p>
+    <w:p>
+      <w:pPr>
+        <w:pStyle w:val="BodyText"/>
+        <w:rPr/>
+      </w:pPr>
+      <w:r>
+        <w:rPr/>
+        <w:t>0 → 1 → 0 pulse on DO_1</w:t>
+        <w:br/>
+        <w:t>(using DO() + Continue() at each stage)</w:t>
+      </w:r>
+    </w:p>
+    <w:p>
+      <w:pPr>
+        <w:pStyle w:val="BodyText"/>
+        <w:rPr/>
+      </w:pPr>
+      <w:r>
+        <w:rPr/>
+        <w:t>Behavioral characteristics:</w:t>
+      </w:r>
+    </w:p>
+    <w:p>
+      <w:pPr>
+        <w:pStyle w:val="BodyText"/>
+        <w:numPr>
+          <w:ilvl w:val="0"/>
+          <w:numId w:val="32"/>
+        </w:numPr>
+        <w:tabs>
+          <w:tab w:val="clear" w:pos="720"/>
+          <w:tab w:val="left" w:pos="0" w:leader="none"/>
+        </w:tabs>
+        <w:ind w:hanging="283" w:left="709"/>
+        <w:rPr/>
+      </w:pPr>
+      <w:r>
+        <w:rPr/>
+        <w:t>One pulse produces one actuation cycle.</w:t>
+      </w:r>
+    </w:p>
+    <w:p>
+      <w:pPr>
+        <w:pStyle w:val="BodyText"/>
+        <w:numPr>
+          <w:ilvl w:val="0"/>
+          <w:numId w:val="32"/>
+        </w:numPr>
+        <w:tabs>
+          <w:tab w:val="clear" w:pos="720"/>
+          <w:tab w:val="left" w:pos="0" w:leader="none"/>
+        </w:tabs>
+        <w:ind w:hanging="283" w:left="709"/>
+        <w:rPr/>
+      </w:pPr>
+      <w:r>
+        <w:rPr/>
+        <w:t>Current I/O mode appears to produce an open-close cycle per pulse.</w:t>
+      </w:r>
+    </w:p>
+    <w:p>
+      <w:pPr>
+        <w:pStyle w:val="BodyText"/>
+        <w:numPr>
+          <w:ilvl w:val="0"/>
+          <w:numId w:val="32"/>
+        </w:numPr>
+        <w:tabs>
+          <w:tab w:val="clear" w:pos="720"/>
+          <w:tab w:val="left" w:pos="0" w:leader="none"/>
+        </w:tabs>
+        <w:ind w:hanging="283" w:left="709"/>
+        <w:rPr/>
+      </w:pPr>
+      <w:r>
+        <w:rPr/>
+        <w:t>True deterministic open/close semantics will require DI feedback integration or Modbus control.</w:t>
+      </w:r>
+    </w:p>
+    <w:p>
+      <w:pPr>
+        <w:pStyle w:val="BodyText"/>
+        <w:rPr/>
+      </w:pPr>
+      <w:r>
+        <w:rPr/>
+        <w:t>Important Operational Requirement:</w:t>
+      </w:r>
+    </w:p>
+    <w:p>
+      <w:pPr>
+        <w:pStyle w:val="BodyText"/>
+        <w:rPr/>
+      </w:pPr>
+      <w:r>
+        <w:rPr/>
+        <w:t>The gripper must be initialized via DH Robotics UI before runtime.</w:t>
+      </w:r>
+    </w:p>
+    <w:p>
+      <w:pPr>
+        <w:pStyle w:val="BodyText"/>
+        <w:rPr/>
+      </w:pPr>
+      <w:r>
+        <w:rPr/>
+        <w:t>Pre-flight checklist:</w:t>
+      </w:r>
+    </w:p>
+    <w:p>
+      <w:pPr>
+        <w:pStyle w:val="BodyText"/>
+        <w:numPr>
+          <w:ilvl w:val="0"/>
+          <w:numId w:val="33"/>
+        </w:numPr>
+        <w:tabs>
+          <w:tab w:val="clear" w:pos="720"/>
+          <w:tab w:val="left" w:pos="0" w:leader="none"/>
+        </w:tabs>
+        <w:ind w:hanging="283" w:left="709"/>
+        <w:rPr/>
+      </w:pPr>
+      <w:r>
+        <w:rPr/>
+        <w:t>Launch DH Gripper UI.</w:t>
+      </w:r>
+    </w:p>
+    <w:p>
+      <w:pPr>
+        <w:pStyle w:val="BodyText"/>
+        <w:numPr>
+          <w:ilvl w:val="0"/>
+          <w:numId w:val="33"/>
+        </w:numPr>
+        <w:tabs>
+          <w:tab w:val="clear" w:pos="720"/>
+          <w:tab w:val="left" w:pos="0" w:leader="none"/>
+        </w:tabs>
+        <w:ind w:hanging="283" w:left="709"/>
+        <w:rPr/>
+      </w:pPr>
+      <w:r>
+        <w:rPr/>
+        <w:t>Initialize gripper.</w:t>
+      </w:r>
+    </w:p>
+    <w:p>
+      <w:pPr>
+        <w:pStyle w:val="BodyText"/>
+        <w:numPr>
+          <w:ilvl w:val="0"/>
+          <w:numId w:val="33"/>
+        </w:numPr>
+        <w:tabs>
+          <w:tab w:val="clear" w:pos="720"/>
+          <w:tab w:val="left" w:pos="0" w:leader="none"/>
+        </w:tabs>
+        <w:ind w:hanging="283" w:left="709"/>
+        <w:rPr/>
+      </w:pPr>
+      <w:r>
+        <w:rPr/>
+        <w:t>Ensure I/O Mode is enabled.</w:t>
+      </w:r>
+    </w:p>
+    <w:p>
+      <w:pPr>
+        <w:pStyle w:val="BodyText"/>
+        <w:numPr>
+          <w:ilvl w:val="0"/>
+          <w:numId w:val="33"/>
+        </w:numPr>
+        <w:tabs>
+          <w:tab w:val="clear" w:pos="720"/>
+          <w:tab w:val="left" w:pos="0" w:leader="none"/>
+        </w:tabs>
+        <w:ind w:hanging="283" w:left="709"/>
+        <w:rPr/>
+      </w:pPr>
+      <w:r>
+        <w:rPr/>
+        <w:t>Start Task Controller.</w:t>
+      </w:r>
+    </w:p>
+    <w:p>
+      <w:pPr>
+        <w:pStyle w:val="BodyText"/>
+        <w:numPr>
+          <w:ilvl w:val="0"/>
+          <w:numId w:val="33"/>
+        </w:numPr>
+        <w:tabs>
+          <w:tab w:val="clear" w:pos="720"/>
+          <w:tab w:val="left" w:pos="0" w:leader="none"/>
+        </w:tabs>
+        <w:ind w:hanging="283" w:left="709"/>
+        <w:rPr/>
+      </w:pPr>
+      <w:r>
+        <w:rPr/>
+        <w:t>Verify one manual pulse toggles actuation.</w:t>
+      </w:r>
+    </w:p>
+    <w:p>
+      <w:pPr>
+        <w:pStyle w:val="BodyText"/>
+        <w:rPr/>
+      </w:pPr>
+      <w:r>
+        <w:rPr/>
+        <w:t>This initialization is not yet automated in the Motion Driver.</w:t>
+      </w:r>
+    </w:p>
+    <w:p>
+      <w:pPr>
+        <w:pStyle w:val="BodyText"/>
+        <w:rPr>
+          <w:rFonts w:ascii="Aptos" w:hAnsi="Aptos"/>
+          <w:lang w:val="en-AU"/>
+        </w:rPr>
+      </w:pPr>
+      <w:r>
+        <w:rPr/>
+      </w:r>
+    </w:p>
+    <w:p>
+      <w:pPr>
+        <w:pStyle w:val="Normal"/>
+        <w:rPr>
+          <w:rFonts w:ascii="Aptos" w:hAnsi="Aptos"/>
+          <w:lang w:val="en-AU"/>
+        </w:rPr>
+      </w:pPr>
+      <w:r>
+        <w:rPr>
+          <w:lang w:val="en-AU"/>
+        </w:rPr>
       </w:r>
     </w:p>
     <w:p>
@@ -3748,6 +4151,161 @@
       </w:pPr>
       <w:r>
         <w:rPr/>
+      </w:r>
+    </w:p>
+    <w:p>
+      <w:pPr>
+        <w:pStyle w:val="Heading3"/>
+        <w:rPr>
+          <w:rFonts w:ascii="Aptos" w:hAnsi="Aptos"/>
+          <w:lang w:val="en-AU"/>
+        </w:rPr>
+      </w:pPr>
+      <w:r>
+        <w:rPr>
+          <w:rFonts w:ascii="Aptos" w:hAnsi="Aptos"/>
+          <w:lang w:val="en-AU"/>
+        </w:rPr>
+        <w:t>Gripper Safety Considerations</w:t>
+      </w:r>
+    </w:p>
+    <w:p>
+      <w:pPr>
+        <w:pStyle w:val="BodyText"/>
+        <w:rPr/>
+      </w:pPr>
+      <w:r>
+        <w:rPr/>
+        <w:t>Because gripper control is pulse-based and not yet state-aware:</w:t>
+      </w:r>
+    </w:p>
+    <w:p>
+      <w:pPr>
+        <w:pStyle w:val="BodyText"/>
+        <w:numPr>
+          <w:ilvl w:val="0"/>
+          <w:numId w:val="34"/>
+        </w:numPr>
+        <w:tabs>
+          <w:tab w:val="clear" w:pos="720"/>
+          <w:tab w:val="left" w:pos="0" w:leader="none"/>
+        </w:tabs>
+        <w:ind w:hanging="283" w:left="709"/>
+        <w:rPr/>
+      </w:pPr>
+      <w:r>
+        <w:rPr/>
+        <w:t>No DI feedback is currently read.</w:t>
+      </w:r>
+    </w:p>
+    <w:p>
+      <w:pPr>
+        <w:pStyle w:val="BodyText"/>
+        <w:numPr>
+          <w:ilvl w:val="0"/>
+          <w:numId w:val="34"/>
+        </w:numPr>
+        <w:tabs>
+          <w:tab w:val="clear" w:pos="720"/>
+          <w:tab w:val="left" w:pos="0" w:leader="none"/>
+        </w:tabs>
+        <w:ind w:hanging="283" w:left="709"/>
+        <w:rPr/>
+      </w:pPr>
+      <w:r>
+        <w:rPr/>
+        <w:t>Software assumes pulse = single actuation.</w:t>
+      </w:r>
+    </w:p>
+    <w:p>
+      <w:pPr>
+        <w:pStyle w:val="BodyText"/>
+        <w:numPr>
+          <w:ilvl w:val="0"/>
+          <w:numId w:val="34"/>
+        </w:numPr>
+        <w:tabs>
+          <w:tab w:val="clear" w:pos="720"/>
+          <w:tab w:val="left" w:pos="0" w:leader="none"/>
+        </w:tabs>
+        <w:ind w:hanging="283" w:left="709"/>
+        <w:rPr/>
+      </w:pPr>
+      <w:r>
+        <w:rPr/>
+        <w:t>Operator must ensure gripper state before initiating Pick.</w:t>
+      </w:r>
+    </w:p>
+    <w:p>
+      <w:pPr>
+        <w:pStyle w:val="BodyText"/>
+        <w:rPr/>
+      </w:pPr>
+      <w:r>
+        <w:rPr/>
+        <w:t>Future hardening step:</w:t>
+      </w:r>
+    </w:p>
+    <w:p>
+      <w:pPr>
+        <w:pStyle w:val="BodyText"/>
+        <w:numPr>
+          <w:ilvl w:val="0"/>
+          <w:numId w:val="35"/>
+        </w:numPr>
+        <w:tabs>
+          <w:tab w:val="clear" w:pos="720"/>
+          <w:tab w:val="left" w:pos="0" w:leader="none"/>
+        </w:tabs>
+        <w:ind w:hanging="283" w:left="709"/>
+        <w:rPr/>
+      </w:pPr>
+      <w:r>
+        <w:rPr/>
+        <w:t>Integrate DI_1 / DI_2 state reading.</w:t>
+      </w:r>
+    </w:p>
+    <w:p>
+      <w:pPr>
+        <w:pStyle w:val="BodyText"/>
+        <w:numPr>
+          <w:ilvl w:val="0"/>
+          <w:numId w:val="35"/>
+        </w:numPr>
+        <w:tabs>
+          <w:tab w:val="clear" w:pos="720"/>
+          <w:tab w:val="left" w:pos="0" w:leader="none"/>
+        </w:tabs>
+        <w:ind w:hanging="283" w:left="709"/>
+        <w:rPr/>
+      </w:pPr>
+      <w:r>
+        <w:rPr/>
+        <w:t>Transition gripper commands from toggle-based to state-driven open/close.</w:t>
+      </w:r>
+    </w:p>
+    <w:p>
+      <w:pPr>
+        <w:pStyle w:val="Normal"/>
+        <w:rPr>
+          <w:rFonts w:ascii="Aptos" w:hAnsi="Aptos"/>
+          <w:lang w:val="en-AU"/>
+        </w:rPr>
+      </w:pPr>
+      <w:r>
+        <w:rPr/>
+      </w:r>
+    </w:p>
+    <w:p>
+      <w:pPr>
+        <w:pStyle w:val="Normal"/>
+        <w:rPr>
+          <w:rFonts w:ascii="Aptos" w:hAnsi="Aptos"/>
+          <w:lang w:val="en-AU"/>
+        </w:rPr>
+      </w:pPr>
+      <w:r>
+        <w:rPr/>
         <mc:AlternateContent>
           <mc:Choice Requires="wps">
             <w:drawing>
@@ -4088,7 +4646,9 @@
         </w:rPr>
       </w:pPr>
       <w:r>
-        <w:rPr/>
+        <w:rPr>
+          <w:lang w:val="en-AU"/>
+        </w:rPr>
       </w:r>
     </w:p>
     <w:p>
@@ -4196,7 +4756,9 @@
         </w:rPr>
       </w:pPr>
       <w:r>
-        <w:rPr/>
+        <w:rPr>
+          <w:lang w:val="en-AU"/>
+        </w:rPr>
       </w:r>
     </w:p>
     <w:p>
@@ -4355,7 +4917,9 @@
         <w:rPr>
           <w:lang w:val="en-AU"/>
         </w:rPr>
-        <w:t>Implement gripper control.</w:t>
+        <w:t>Implement base DO pulse-based gripper control (completed 19 Feb 2026).</w:t>
+        <w:br/>
+        <w:t>Future: add DI feedback for deterministic state control.</w:t>
       </w:r>
     </w:p>
     <w:p>
@@ -9396,6 +9960,673 @@
   <w:abstractNum w:abstractNumId="31">
     <w:lvl w:ilvl="0">
       <w:start w:val="1"/>
+      <w:numFmt w:val="bullet"/>
+      <w:lvlText w:val=""/>
+      <w:lvlJc w:val="left"/>
+      <w:pPr>
+        <w:tabs>
+          <w:tab w:val="num" w:pos="709"/>
+        </w:tabs>
+        <w:ind w:left="709" w:hanging="283"/>
+      </w:pPr>
+      <w:rPr>
+        <w:rFonts w:ascii="Symbol" w:hAnsi="Symbol" w:cs="Symbol" w:hint="default"/>
+      </w:rPr>
+    </w:lvl>
+    <w:lvl w:ilvl="1">
+      <w:start w:val="1"/>
+      <w:numFmt w:val="bullet"/>
+      <w:lvlText w:val=""/>
+      <w:lvlJc w:val="left"/>
+      <w:pPr>
+        <w:tabs>
+          <w:tab w:val="num" w:pos="1418"/>
+        </w:tabs>
+        <w:ind w:left="1418" w:hanging="283"/>
+      </w:pPr>
+      <w:rPr>
+        <w:rFonts w:ascii="Symbol" w:hAnsi="Symbol" w:cs="Symbol" w:hint="default"/>
+      </w:rPr>
+    </w:lvl>
+    <w:lvl w:ilvl="2">
+      <w:start w:val="1"/>
+      <w:numFmt w:val="bullet"/>
+      <w:lvlText w:val=""/>
+      <w:lvlJc w:val="left"/>
+      <w:pPr>
+        <w:tabs>
+          <w:tab w:val="num" w:pos="2127"/>
+        </w:tabs>
+        <w:ind w:left="2127" w:hanging="283"/>
+      </w:pPr>
+      <w:rPr>
+        <w:rFonts w:ascii="Symbol" w:hAnsi="Symbol" w:cs="Symbol" w:hint="default"/>
+      </w:rPr>
+    </w:lvl>
+    <w:lvl w:ilvl="3">
+      <w:start w:val="1"/>
+      <w:numFmt w:val="bullet"/>
+      <w:lvlText w:val=""/>
+      <w:lvlJc w:val="left"/>
+      <w:pPr>
+        <w:tabs>
+          <w:tab w:val="num" w:pos="2836"/>
+        </w:tabs>
+        <w:ind w:left="2836" w:hanging="283"/>
+      </w:pPr>
+      <w:rPr>
+        <w:rFonts w:ascii="Symbol" w:hAnsi="Symbol" w:cs="Symbol" w:hint="default"/>
+      </w:rPr>
+    </w:lvl>
+    <w:lvl w:ilvl="4">
+      <w:start w:val="1"/>
+      <w:numFmt w:val="bullet"/>
+      <w:lvlText w:val=""/>
+      <w:lvlJc w:val="left"/>
+      <w:pPr>
+        <w:tabs>
+          <w:tab w:val="num" w:pos="3545"/>
+        </w:tabs>
+        <w:ind w:left="3545" w:hanging="283"/>
+      </w:pPr>
+      <w:rPr>
+        <w:rFonts w:ascii="Symbol" w:hAnsi="Symbol" w:cs="Symbol" w:hint="default"/>
+      </w:rPr>
+    </w:lvl>
+    <w:lvl w:ilvl="5">
+      <w:start w:val="1"/>
+      <w:numFmt w:val="bullet"/>
+      <w:lvlText w:val=""/>
+      <w:lvlJc w:val="left"/>
+      <w:pPr>
+        <w:tabs>
+          <w:tab w:val="num" w:pos="4254"/>
+        </w:tabs>
+        <w:ind w:left="4254" w:hanging="283"/>
+      </w:pPr>
+      <w:rPr>
+        <w:rFonts w:ascii="Symbol" w:hAnsi="Symbol" w:cs="Symbol" w:hint="default"/>
+      </w:rPr>
+    </w:lvl>
+    <w:lvl w:ilvl="6">
+      <w:start w:val="1"/>
+      <w:numFmt w:val="bullet"/>
+      <w:lvlText w:val=""/>
+      <w:lvlJc w:val="left"/>
+      <w:pPr>
+        <w:tabs>
+          <w:tab w:val="num" w:pos="4963"/>
+        </w:tabs>
+        <w:ind w:left="4963" w:hanging="283"/>
+      </w:pPr>
+      <w:rPr>
+        <w:rFonts w:ascii="Symbol" w:hAnsi="Symbol" w:cs="Symbol" w:hint="default"/>
+      </w:rPr>
+    </w:lvl>
+    <w:lvl w:ilvl="7">
+      <w:start w:val="1"/>
+      <w:numFmt w:val="bullet"/>
+      <w:lvlText w:val=""/>
+      <w:lvlJc w:val="left"/>
+      <w:pPr>
+        <w:tabs>
+          <w:tab w:val="num" w:pos="5672"/>
+        </w:tabs>
+        <w:ind w:left="5672" w:hanging="283"/>
+      </w:pPr>
+      <w:rPr>
+        <w:rFonts w:ascii="Symbol" w:hAnsi="Symbol" w:cs="Symbol" w:hint="default"/>
+      </w:rPr>
+    </w:lvl>
+    <w:lvl w:ilvl="8">
+      <w:start w:val="1"/>
+      <w:numFmt w:val="bullet"/>
+      <w:lvlText w:val=""/>
+      <w:lvlJc w:val="left"/>
+      <w:pPr>
+        <w:tabs>
+          <w:tab w:val="num" w:pos="6381"/>
+        </w:tabs>
+        <w:ind w:left="6381" w:hanging="283"/>
+      </w:pPr>
+      <w:rPr>
+        <w:rFonts w:ascii="Symbol" w:hAnsi="Symbol" w:cs="Symbol" w:hint="default"/>
+      </w:rPr>
+    </w:lvl>
+  </w:abstractNum>
+  <w:abstractNum w:abstractNumId="32">
+    <w:lvl w:ilvl="0">
+      <w:start w:val="1"/>
+      <w:numFmt w:val="bullet"/>
+      <w:lvlText w:val=""/>
+      <w:lvlJc w:val="left"/>
+      <w:pPr>
+        <w:tabs>
+          <w:tab w:val="num" w:pos="709"/>
+        </w:tabs>
+        <w:ind w:left="709" w:hanging="283"/>
+      </w:pPr>
+      <w:rPr>
+        <w:rFonts w:ascii="Symbol" w:hAnsi="Symbol" w:cs="Symbol" w:hint="default"/>
+      </w:rPr>
+    </w:lvl>
+    <w:lvl w:ilvl="1">
+      <w:start w:val="1"/>
+      <w:numFmt w:val="bullet"/>
+      <w:lvlText w:val=""/>
+      <w:lvlJc w:val="left"/>
+      <w:pPr>
+        <w:tabs>
+          <w:tab w:val="num" w:pos="1418"/>
+        </w:tabs>
+        <w:ind w:left="1418" w:hanging="283"/>
+      </w:pPr>
+      <w:rPr>
+        <w:rFonts w:ascii="Symbol" w:hAnsi="Symbol" w:cs="Symbol" w:hint="default"/>
+      </w:rPr>
+    </w:lvl>
+    <w:lvl w:ilvl="2">
+      <w:start w:val="1"/>
+      <w:numFmt w:val="bullet"/>
+      <w:lvlText w:val=""/>
+      <w:lvlJc w:val="left"/>
+      <w:pPr>
+        <w:tabs>
+          <w:tab w:val="num" w:pos="2127"/>
+        </w:tabs>
+        <w:ind w:left="2127" w:hanging="283"/>
+      </w:pPr>
+      <w:rPr>
+        <w:rFonts w:ascii="Symbol" w:hAnsi="Symbol" w:cs="Symbol" w:hint="default"/>
+      </w:rPr>
+    </w:lvl>
+    <w:lvl w:ilvl="3">
+      <w:start w:val="1"/>
+      <w:numFmt w:val="bullet"/>
+      <w:lvlText w:val=""/>
+      <w:lvlJc w:val="left"/>
+      <w:pPr>
+        <w:tabs>
+          <w:tab w:val="num" w:pos="2836"/>
+        </w:tabs>
+        <w:ind w:left="2836" w:hanging="283"/>
+      </w:pPr>
+      <w:rPr>
+        <w:rFonts w:ascii="Symbol" w:hAnsi="Symbol" w:cs="Symbol" w:hint="default"/>
+      </w:rPr>
+    </w:lvl>
+    <w:lvl w:ilvl="4">
+      <w:start w:val="1"/>
+      <w:numFmt w:val="bullet"/>
+      <w:lvlText w:val=""/>
+      <w:lvlJc w:val="left"/>
+      <w:pPr>
+        <w:tabs>
+          <w:tab w:val="num" w:pos="3545"/>
+        </w:tabs>
+        <w:ind w:left="3545" w:hanging="283"/>
+      </w:pPr>
+      <w:rPr>
+        <w:rFonts w:ascii="Symbol" w:hAnsi="Symbol" w:cs="Symbol" w:hint="default"/>
+      </w:rPr>
+    </w:lvl>
+    <w:lvl w:ilvl="5">
+      <w:start w:val="1"/>
+      <w:numFmt w:val="bullet"/>
+      <w:lvlText w:val=""/>
+      <w:lvlJc w:val="left"/>
+      <w:pPr>
+        <w:tabs>
+          <w:tab w:val="num" w:pos="4254"/>
+        </w:tabs>
+        <w:ind w:left="4254" w:hanging="283"/>
+      </w:pPr>
+      <w:rPr>
+        <w:rFonts w:ascii="Symbol" w:hAnsi="Symbol" w:cs="Symbol" w:hint="default"/>
+      </w:rPr>
+    </w:lvl>
+    <w:lvl w:ilvl="6">
+      <w:start w:val="1"/>
+      <w:numFmt w:val="bullet"/>
+      <w:lvlText w:val=""/>
+      <w:lvlJc w:val="left"/>
+      <w:pPr>
+        <w:tabs>
+          <w:tab w:val="num" w:pos="4963"/>
+        </w:tabs>
+        <w:ind w:left="4963" w:hanging="283"/>
+      </w:pPr>
+      <w:rPr>
+        <w:rFonts w:ascii="Symbol" w:hAnsi="Symbol" w:cs="Symbol" w:hint="default"/>
+      </w:rPr>
+    </w:lvl>
+    <w:lvl w:ilvl="7">
+      <w:start w:val="1"/>
+      <w:numFmt w:val="bullet"/>
+      <w:lvlText w:val=""/>
+      <w:lvlJc w:val="left"/>
+      <w:pPr>
+        <w:tabs>
+          <w:tab w:val="num" w:pos="5672"/>
+        </w:tabs>
+        <w:ind w:left="5672" w:hanging="283"/>
+      </w:pPr>
+      <w:rPr>
+        <w:rFonts w:ascii="Symbol" w:hAnsi="Symbol" w:cs="Symbol" w:hint="default"/>
+      </w:rPr>
+    </w:lvl>
+    <w:lvl w:ilvl="8">
+      <w:start w:val="1"/>
+      <w:numFmt w:val="bullet"/>
+      <w:lvlText w:val=""/>
+      <w:lvlJc w:val="left"/>
+      <w:pPr>
+        <w:tabs>
+          <w:tab w:val="num" w:pos="6381"/>
+        </w:tabs>
+        <w:ind w:left="6381" w:hanging="283"/>
+      </w:pPr>
+      <w:rPr>
+        <w:rFonts w:ascii="Symbol" w:hAnsi="Symbol" w:cs="Symbol" w:hint="default"/>
+      </w:rPr>
+    </w:lvl>
+  </w:abstractNum>
+  <w:abstractNum w:abstractNumId="33">
+    <w:lvl w:ilvl="0">
+      <w:start w:val="1"/>
+      <w:numFmt w:val="decimal"/>
+      <w:lvlText w:val="%1."/>
+      <w:lvlJc w:val="left"/>
+      <w:pPr>
+        <w:tabs>
+          <w:tab w:val="num" w:pos="709"/>
+        </w:tabs>
+        <w:ind w:left="709" w:hanging="283"/>
+      </w:pPr>
+      <w:rPr/>
+    </w:lvl>
+    <w:lvl w:ilvl="1">
+      <w:start w:val="1"/>
+      <w:numFmt w:val="decimal"/>
+      <w:lvlText w:val="%2."/>
+      <w:lvlJc w:val="left"/>
+      <w:pPr>
+        <w:tabs>
+          <w:tab w:val="num" w:pos="1418"/>
+        </w:tabs>
+        <w:ind w:left="1418" w:hanging="283"/>
+      </w:pPr>
+      <w:rPr/>
+    </w:lvl>
+    <w:lvl w:ilvl="2">
+      <w:start w:val="1"/>
+      <w:numFmt w:val="decimal"/>
+      <w:lvlText w:val="%3."/>
+      <w:lvlJc w:val="left"/>
+      <w:pPr>
+        <w:tabs>
+          <w:tab w:val="num" w:pos="2127"/>
+        </w:tabs>
+        <w:ind w:left="2127" w:hanging="283"/>
+      </w:pPr>
+      <w:rPr/>
+    </w:lvl>
+    <w:lvl w:ilvl="3">
+      <w:start w:val="1"/>
+      <w:numFmt w:val="decimal"/>
+      <w:lvlText w:val="%4."/>
+      <w:lvlJc w:val="left"/>
+      <w:pPr>
+        <w:tabs>
+          <w:tab w:val="num" w:pos="2836"/>
+        </w:tabs>
+        <w:ind w:left="2836" w:hanging="283"/>
+      </w:pPr>
+      <w:rPr/>
+    </w:lvl>
+    <w:lvl w:ilvl="4">
+      <w:start w:val="1"/>
+      <w:numFmt w:val="decimal"/>
+      <w:lvlText w:val="%5."/>
+      <w:lvlJc w:val="left"/>
+      <w:pPr>
+        <w:tabs>
+          <w:tab w:val="num" w:pos="3545"/>
+        </w:tabs>
+        <w:ind w:left="3545" w:hanging="283"/>
+      </w:pPr>
+      <w:rPr/>
+    </w:lvl>
+    <w:lvl w:ilvl="5">
+      <w:start w:val="1"/>
+      <w:numFmt w:val="decimal"/>
+      <w:lvlText w:val="%6."/>
+      <w:lvlJc w:val="left"/>
+      <w:pPr>
+        <w:tabs>
+          <w:tab w:val="num" w:pos="4254"/>
+        </w:tabs>
+        <w:ind w:left="4254" w:hanging="283"/>
+      </w:pPr>
+      <w:rPr/>
+    </w:lvl>
+    <w:lvl w:ilvl="6">
+      <w:start w:val="1"/>
+      <w:numFmt w:val="decimal"/>
+      <w:lvlText w:val="%7."/>
+      <w:lvlJc w:val="left"/>
+      <w:pPr>
+        <w:tabs>
+          <w:tab w:val="num" w:pos="4963"/>
+        </w:tabs>
+        <w:ind w:left="4963" w:hanging="283"/>
+      </w:pPr>
+      <w:rPr/>
+    </w:lvl>
+    <w:lvl w:ilvl="7">
+      <w:start w:val="1"/>
+      <w:numFmt w:val="decimal"/>
+      <w:lvlText w:val="%8."/>
+      <w:lvlJc w:val="left"/>
+      <w:pPr>
+        <w:tabs>
+          <w:tab w:val="num" w:pos="5672"/>
+        </w:tabs>
+        <w:ind w:left="5672" w:hanging="283"/>
+      </w:pPr>
+      <w:rPr/>
+    </w:lvl>
+    <w:lvl w:ilvl="8">
+      <w:start w:val="1"/>
+      <w:numFmt w:val="decimal"/>
+      <w:lvlText w:val="%9."/>
+      <w:lvlJc w:val="left"/>
+      <w:pPr>
+        <w:tabs>
+          <w:tab w:val="num" w:pos="6381"/>
+        </w:tabs>
+        <w:ind w:left="6381" w:hanging="283"/>
+      </w:pPr>
+      <w:rPr/>
+    </w:lvl>
+  </w:abstractNum>
+  <w:abstractNum w:abstractNumId="34">
+    <w:lvl w:ilvl="0">
+      <w:start w:val="1"/>
+      <w:numFmt w:val="bullet"/>
+      <w:lvlText w:val=""/>
+      <w:lvlJc w:val="left"/>
+      <w:pPr>
+        <w:tabs>
+          <w:tab w:val="num" w:pos="709"/>
+        </w:tabs>
+        <w:ind w:left="709" w:hanging="283"/>
+      </w:pPr>
+      <w:rPr>
+        <w:rFonts w:ascii="Symbol" w:hAnsi="Symbol" w:cs="Symbol" w:hint="default"/>
+      </w:rPr>
+    </w:lvl>
+    <w:lvl w:ilvl="1">
+      <w:start w:val="1"/>
+      <w:numFmt w:val="bullet"/>
+      <w:lvlText w:val=""/>
+      <w:lvlJc w:val="left"/>
+      <w:pPr>
+        <w:tabs>
+          <w:tab w:val="num" w:pos="1418"/>
+        </w:tabs>
+        <w:ind w:left="1418" w:hanging="283"/>
+      </w:pPr>
+      <w:rPr>
+        <w:rFonts w:ascii="Symbol" w:hAnsi="Symbol" w:cs="Symbol" w:hint="default"/>
+      </w:rPr>
+    </w:lvl>
+    <w:lvl w:ilvl="2">
+      <w:start w:val="1"/>
+      <w:numFmt w:val="bullet"/>
+      <w:lvlText w:val=""/>
+      <w:lvlJc w:val="left"/>
+      <w:pPr>
+        <w:tabs>
+          <w:tab w:val="num" w:pos="2127"/>
+        </w:tabs>
+        <w:ind w:left="2127" w:hanging="283"/>
+      </w:pPr>
+      <w:rPr>
+        <w:rFonts w:ascii="Symbol" w:hAnsi="Symbol" w:cs="Symbol" w:hint="default"/>
+      </w:rPr>
+    </w:lvl>
+    <w:lvl w:ilvl="3">
+      <w:start w:val="1"/>
+      <w:numFmt w:val="bullet"/>
+      <w:lvlText w:val=""/>
+      <w:lvlJc w:val="left"/>
+      <w:pPr>
+        <w:tabs>
+          <w:tab w:val="num" w:pos="2836"/>
+        </w:tabs>
+        <w:ind w:left="2836" w:hanging="283"/>
+      </w:pPr>
+      <w:rPr>
+        <w:rFonts w:ascii="Symbol" w:hAnsi="Symbol" w:cs="Symbol" w:hint="default"/>
+      </w:rPr>
+    </w:lvl>
+    <w:lvl w:ilvl="4">
+      <w:start w:val="1"/>
+      <w:numFmt w:val="bullet"/>
+      <w:lvlText w:val=""/>
+      <w:lvlJc w:val="left"/>
+      <w:pPr>
+        <w:tabs>
+          <w:tab w:val="num" w:pos="3545"/>
+        </w:tabs>
+        <w:ind w:left="3545" w:hanging="283"/>
+      </w:pPr>
+      <w:rPr>
+        <w:rFonts w:ascii="Symbol" w:hAnsi="Symbol" w:cs="Symbol" w:hint="default"/>
+      </w:rPr>
+    </w:lvl>
+    <w:lvl w:ilvl="5">
+      <w:start w:val="1"/>
+      <w:numFmt w:val="bullet"/>
+      <w:lvlText w:val=""/>
+      <w:lvlJc w:val="left"/>
+      <w:pPr>
+        <w:tabs>
+          <w:tab w:val="num" w:pos="4254"/>
+        </w:tabs>
+        <w:ind w:left="4254" w:hanging="283"/>
+      </w:pPr>
+      <w:rPr>
+        <w:rFonts w:ascii="Symbol" w:hAnsi="Symbol" w:cs="Symbol" w:hint="default"/>
+      </w:rPr>
+    </w:lvl>
+    <w:lvl w:ilvl="6">
+      <w:start w:val="1"/>
+      <w:numFmt w:val="bullet"/>
+      <w:lvlText w:val=""/>
+      <w:lvlJc w:val="left"/>
+      <w:pPr>
+        <w:tabs>
+          <w:tab w:val="num" w:pos="4963"/>
+        </w:tabs>
+        <w:ind w:left="4963" w:hanging="283"/>
+      </w:pPr>
+      <w:rPr>
+        <w:rFonts w:ascii="Symbol" w:hAnsi="Symbol" w:cs="Symbol" w:hint="default"/>
+      </w:rPr>
+    </w:lvl>
+    <w:lvl w:ilvl="7">
+      <w:start w:val="1"/>
+      <w:numFmt w:val="bullet"/>
+      <w:lvlText w:val=""/>
+      <w:lvlJc w:val="left"/>
+      <w:pPr>
+        <w:tabs>
+          <w:tab w:val="num" w:pos="5672"/>
+        </w:tabs>
+        <w:ind w:left="5672" w:hanging="283"/>
+      </w:pPr>
+      <w:rPr>
+        <w:rFonts w:ascii="Symbol" w:hAnsi="Symbol" w:cs="Symbol" w:hint="default"/>
+      </w:rPr>
+    </w:lvl>
+    <w:lvl w:ilvl="8">
+      <w:start w:val="1"/>
+      <w:numFmt w:val="bullet"/>
+      <w:lvlText w:val=""/>
+      <w:lvlJc w:val="left"/>
+      <w:pPr>
+        <w:tabs>
+          <w:tab w:val="num" w:pos="6381"/>
+        </w:tabs>
+        <w:ind w:left="6381" w:hanging="283"/>
+      </w:pPr>
+      <w:rPr>
+        <w:rFonts w:ascii="Symbol" w:hAnsi="Symbol" w:cs="Symbol" w:hint="default"/>
+      </w:rPr>
+    </w:lvl>
+  </w:abstractNum>
+  <w:abstractNum w:abstractNumId="35">
+    <w:lvl w:ilvl="0">
+      <w:start w:val="1"/>
+      <w:numFmt w:val="bullet"/>
+      <w:lvlText w:val=""/>
+      <w:lvlJc w:val="left"/>
+      <w:pPr>
+        <w:tabs>
+          <w:tab w:val="num" w:pos="709"/>
+        </w:tabs>
+        <w:ind w:left="709" w:hanging="283"/>
+      </w:pPr>
+      <w:rPr>
+        <w:rFonts w:ascii="Symbol" w:hAnsi="Symbol" w:cs="Symbol" w:hint="default"/>
+      </w:rPr>
+    </w:lvl>
+    <w:lvl w:ilvl="1">
+      <w:start w:val="1"/>
+      <w:numFmt w:val="bullet"/>
+      <w:lvlText w:val=""/>
+      <w:lvlJc w:val="left"/>
+      <w:pPr>
+        <w:tabs>
+          <w:tab w:val="num" w:pos="1418"/>
+        </w:tabs>
+        <w:ind w:left="1418" w:hanging="283"/>
+      </w:pPr>
+      <w:rPr>
+        <w:rFonts w:ascii="Symbol" w:hAnsi="Symbol" w:cs="Symbol" w:hint="default"/>
+      </w:rPr>
+    </w:lvl>
+    <w:lvl w:ilvl="2">
+      <w:start w:val="1"/>
+      <w:numFmt w:val="bullet"/>
+      <w:lvlText w:val=""/>
+      <w:lvlJc w:val="left"/>
+      <w:pPr>
+        <w:tabs>
+          <w:tab w:val="num" w:pos="2127"/>
+        </w:tabs>
+        <w:ind w:left="2127" w:hanging="283"/>
+      </w:pPr>
+      <w:rPr>
+        <w:rFonts w:ascii="Symbol" w:hAnsi="Symbol" w:cs="Symbol" w:hint="default"/>
+      </w:rPr>
+    </w:lvl>
+    <w:lvl w:ilvl="3">
+      <w:start w:val="1"/>
+      <w:numFmt w:val="bullet"/>
+      <w:lvlText w:val=""/>
+      <w:lvlJc w:val="left"/>
+      <w:pPr>
+        <w:tabs>
+          <w:tab w:val="num" w:pos="2836"/>
+        </w:tabs>
+        <w:ind w:left="2836" w:hanging="283"/>
+      </w:pPr>
+      <w:rPr>
+        <w:rFonts w:ascii="Symbol" w:hAnsi="Symbol" w:cs="Symbol" w:hint="default"/>
+      </w:rPr>
+    </w:lvl>
+    <w:lvl w:ilvl="4">
+      <w:start w:val="1"/>
+      <w:numFmt w:val="bullet"/>
+      <w:lvlText w:val=""/>
+      <w:lvlJc w:val="left"/>
+      <w:pPr>
+        <w:tabs>
+          <w:tab w:val="num" w:pos="3545"/>
+        </w:tabs>
+        <w:ind w:left="3545" w:hanging="283"/>
+      </w:pPr>
+      <w:rPr>
+        <w:rFonts w:ascii="Symbol" w:hAnsi="Symbol" w:cs="Symbol" w:hint="default"/>
+      </w:rPr>
+    </w:lvl>
+    <w:lvl w:ilvl="5">
+      <w:start w:val="1"/>
+      <w:numFmt w:val="bullet"/>
+      <w:lvlText w:val=""/>
+      <w:lvlJc w:val="left"/>
+      <w:pPr>
+        <w:tabs>
+          <w:tab w:val="num" w:pos="4254"/>
+        </w:tabs>
+        <w:ind w:left="4254" w:hanging="283"/>
+      </w:pPr>
+      <w:rPr>
+        <w:rFonts w:ascii="Symbol" w:hAnsi="Symbol" w:cs="Symbol" w:hint="default"/>
+      </w:rPr>
+    </w:lvl>
+    <w:lvl w:ilvl="6">
+      <w:start w:val="1"/>
+      <w:numFmt w:val="bullet"/>
+      <w:lvlText w:val=""/>
+      <w:lvlJc w:val="left"/>
+      <w:pPr>
+        <w:tabs>
+          <w:tab w:val="num" w:pos="4963"/>
+        </w:tabs>
+        <w:ind w:left="4963" w:hanging="283"/>
+      </w:pPr>
+      <w:rPr>
+        <w:rFonts w:ascii="Symbol" w:hAnsi="Symbol" w:cs="Symbol" w:hint="default"/>
+      </w:rPr>
+    </w:lvl>
+    <w:lvl w:ilvl="7">
+      <w:start w:val="1"/>
+      <w:numFmt w:val="bullet"/>
+      <w:lvlText w:val=""/>
+      <w:lvlJc w:val="left"/>
+      <w:pPr>
+        <w:tabs>
+          <w:tab w:val="num" w:pos="5672"/>
+        </w:tabs>
+        <w:ind w:left="5672" w:hanging="283"/>
+      </w:pPr>
+      <w:rPr>
+        <w:rFonts w:ascii="Symbol" w:hAnsi="Symbol" w:cs="Symbol" w:hint="default"/>
+      </w:rPr>
+    </w:lvl>
+    <w:lvl w:ilvl="8">
+      <w:start w:val="1"/>
+      <w:numFmt w:val="bullet"/>
+      <w:lvlText w:val=""/>
+      <w:lvlJc w:val="left"/>
+      <w:pPr>
+        <w:tabs>
+          <w:tab w:val="num" w:pos="6381"/>
+        </w:tabs>
+        <w:ind w:left="6381" w:hanging="283"/>
+      </w:pPr>
+      <w:rPr>
+        <w:rFonts w:ascii="Symbol" w:hAnsi="Symbol" w:cs="Symbol" w:hint="default"/>
+      </w:rPr>
+    </w:lvl>
+  </w:abstractNum>
+  <w:abstractNum w:abstractNumId="36">
+    <w:lvl w:ilvl="0">
+      <w:start w:val="1"/>
       <w:numFmt w:val="none"/>
       <w:suff w:val="nothing"/>
       <w:lvlText w:val=""/>
@@ -9448,7 +10679,6 @@
     </w:lvl>
     <w:lvl w:ilvl="4">
       <w:start w:val="1"/>
-      <w:pStyle w:val="Heading5"/>
       <w:numFmt w:val="none"/>
       <w:suff w:val="nothing"/>
       <w:lvlText w:val=""/>
@@ -9462,7 +10692,6 @@
     </w:lvl>
     <w:lvl w:ilvl="5">
       <w:start w:val="1"/>
-      <w:pStyle w:val="Heading6"/>
       <w:numFmt w:val="none"/>
       <w:suff w:val="nothing"/>
       <w:lvlText w:val=""/>
@@ -9606,6 +10835,21 @@
   </w:num>
   <w:num w:numId="31">
     <w:abstractNumId w:val="31"/>
+  </w:num>
+  <w:num w:numId="32">
+    <w:abstractNumId w:val="32"/>
+  </w:num>
+  <w:num w:numId="33">
+    <w:abstractNumId w:val="33"/>
+  </w:num>
+  <w:num w:numId="34">
+    <w:abstractNumId w:val="34"/>
+  </w:num>
+  <w:num w:numId="35">
+    <w:abstractNumId w:val="35"/>
+  </w:num>
+  <w:num w:numId="36">
+    <w:abstractNumId w:val="36"/>
   </w:num>
 </w:numbering>
 </file>

</xml_diff>